<commit_message>
SPEC-008 (CERT): certificacion local de la remediacion QA Yolinel - sensibilidad S1/S5/S6/S7/S8 5/5 DETECTED (S7 y S8 tras refuerzo IMPL-2 9390afc: guardian de 20 maestros y identidad estable de useCan) con restauracion explicita desde dbd6122/9390afc (FINAL_DIFF=0) ; regresion post-mutacion backend 1739/0/49 identica a la pre-mutacion y frontend 576/576 + tsc + build ; 05-10 actualizados, 10_FINAL_STATUS con bloque de estado, evidencia saneada ; QA_FINDINGS 18: 3 P1 corregidos, 6 UX, 5 decisiones Owner abiertas, PDF pendiente de contraste ; runtime NOT_VERIFIED_FROM_WORKSTATION, QA-DEMO-V1 BLOCKED_EXTERNAL ; sin rama nueva, 0 llamadas SAP
Co-Authored-By: Claude Fable 5.1 <noreply@anthropic.com>
</commit_message>
<xml_diff>
--- a/docs/RESPUESTA_REVISION_GENERAL_QA_YOLINEL_2026_10_17.docx
+++ b/docs/RESPUESTA_REVISION_GENERAL_QA_YOLINEL_2026_10_17.docx
@@ -107,13 +107,13 @@
           <w:i w:val="0"/>
           <w:sz w:val="18"/>
         </w:rPr>
-        <w:t>{{IMPL_SHA}}</w:t>
-      </w:r>
-      <w:r>
-        <w:rPr>
-          <w:i w:val="0"/>
-        </w:rPr>
-        <w:t xml:space="preserve"> · estado </w:t>
+        <w:t>dbd6122</w:t>
+      </w:r>
+      <w:r>
+        <w:rPr>
+          <w:i w:val="0"/>
+        </w:rPr>
+        <w:t xml:space="preserve"> (IMPL) + </w:t>
       </w:r>
       <w:r>
         <w:rPr>
@@ -121,7 +121,21 @@
           <w:i w:val="0"/>
           <w:sz w:val="18"/>
         </w:rPr>
-        <w:t>IMPLEMENTED_PENDING_CERTIFICATION</w:t>
+        <w:t>9390afc</w:t>
+      </w:r>
+      <w:r>
+        <w:rPr>
+          <w:i w:val="0"/>
+        </w:rPr>
+        <w:t xml:space="preserve"> (IMPL-2) · estado </w:t>
+      </w:r>
+      <w:r>
+        <w:rPr>
+          <w:rFonts w:ascii="Consolas" w:hAnsi="Consolas"/>
+          <w:i w:val="0"/>
+          <w:sz w:val="18"/>
+        </w:rPr>
+        <w:t>LOCALLY_CERTIFYING</w:t>
       </w:r>
     </w:p>
     <w:p/>

</xml_diff>